<commit_message>
New EMA routing. Placeholder waiting for Eliana's csv
</commit_message>
<xml_diff>
--- a/Resources/JITAI_Task_Overview.docx
+++ b/Resources/JITAI_Task_Overview.docx
@@ -574,7 +574,7 @@
     <w:p>
       <w:pPr/>
       <w:r>
-        <w:t>Selection rule (updated 2026-08-27):  Root cause found for why Eliana's reconciliation showed only 2 deliverable prompts — the CSV's Telemetry/Survey field is an engineering label for where a prompt idea came from, never a delivery rule, and was never part of IRB approval. Dr. Chang confirmed: route selection by the message bank's real trigger — emotional state (anger, anxiety, stress, low mood, interpersonal conflict, urge/craving) — not by Telemetry/Survey. Once wired, all 26 approved messages are the correct pool. Context-tag mapping partially resolved 2026-08-27: of the 4 Urge/craving messages, Eliana confirmed P027/P029 as drinking-tagged and ruled out P006/P008 as cyber-specific by wording. Still pending: the remaining 22 messages (general-purpose or not), the celebration-tagging structure (same P027/P029 pair under a different gate, or separate — pending Dr. Chang's call), and the C001-C004 active-control messages. Gate conservatively — exclude — for any message ID not yet mapped. Emotional-state matching itself is not yet implemented in select_prompt() — still a random.choice() over the Survey-tagged pool.</w:t>
+        <w:t>Selection rule (full path implemented 2026-09-08):  select_prompt() matches the triggering check-in's B-item answers against ROUTING_TRIGGER_RULES (app/ema_catalog.py), cutoffs confirmed by Dr. Chang 2026-09-07 (scale midpoint+1). Selection is category-first: a matched category is drawn uniformly, then a message uniformly within it, excluding the participant's last 5 delivered prompts. If the drawn category is exhausted by that exclusion, routing redraws among the remaining matched categories (never skips the exclusion, confirmed 2026-09-08); if none remain eligible, or nothing matched at all, it falls through to a general pool, logging 'category_exhausted' or 'no_category_matched'. A separate override sends P020 directly (logged 'closest_fit') when B6_drink_count crosses the gender-specific NIAAA daily limit, ahead of normal category routing. Full rules in Papers/REACT_Routing_Rules_v1.1_2026-09-08.docx. HARD GATE: the general pool is currently 4 fake placeholder IDs (notification_service._GENERAL_FALLBACK_IDS) — must be deleted and replaced with Eliana's real curated list before enrollment (due 2026-09-10, per doc §7).</w:t>
       </w:r>
     </w:p>
     <w:p>
@@ -1603,6 +1603,134 @@
           </w:p>
         </w:tc>
       </w:tr>
+      <w:tr>
+        <w:tc>
+          <w:tcPr>
+            <w:tcW w:type="dxa" w:w="2880"/>
+          </w:tcPr>
+          <w:p>
+            <w:r>
+              <w:t>evaluated_items</w:t>
+            </w:r>
+          </w:p>
+        </w:tc>
+        <w:tc>
+          <w:tcPr>
+            <w:tcW w:type="dxa" w:w="2880"/>
+          </w:tcPr>
+          <w:p>
+            <w:r>
+              <w:t>Routing item snapshot (added 2026-09-07)</w:t>
+            </w:r>
+          </w:p>
+        </w:tc>
+        <w:tc>
+          <w:tcPr>
+            <w:tcW w:type="dxa" w:w="2880"/>
+          </w:tcPr>
+          <w:p>
+            <w:r>
+              <w:t>Dict of every routing sub-item to its value at this check-in, null where the item was not part of that check-in's rotation (not "checked and low").</w:t>
+            </w:r>
+          </w:p>
+        </w:tc>
+      </w:tr>
+      <w:tr>
+        <w:tc>
+          <w:tcPr>
+            <w:tcW w:type="dxa" w:w="2880"/>
+          </w:tcPr>
+          <w:p>
+            <w:r>
+              <w:t>matched_categories</w:t>
+            </w:r>
+          </w:p>
+        </w:tc>
+        <w:tc>
+          <w:tcPr>
+            <w:tcW w:type="dxa" w:w="2880"/>
+          </w:tcPr>
+          <w:p>
+            <w:r>
+              <w:t>Trigger categories matched (added 2026-09-07)</w:t>
+            </w:r>
+          </w:p>
+        </w:tc>
+        <w:tc>
+          <w:tcPr>
+            <w:tcW w:type="dxa" w:w="2880"/>
+          </w:tcPr>
+          <w:p>
+            <w:r>
+              <w:t>List of category names whose ROUTING_TRIGGER_RULES condition was satisfied. Empty list means no-match (fails closed today, pending Eliana's fallback pool).</w:t>
+            </w:r>
+          </w:p>
+        </w:tc>
+      </w:tr>
+      <w:tr>
+        <w:tc>
+          <w:tcPr>
+            <w:tcW w:type="dxa" w:w="2880"/>
+          </w:tcPr>
+          <w:p>
+            <w:r>
+              <w:t>category_drawn</w:t>
+            </w:r>
+          </w:p>
+        </w:tc>
+        <w:tc>
+          <w:tcPr>
+            <w:tcW w:type="dxa" w:w="2880"/>
+          </w:tcPr>
+          <w:p>
+            <w:r>
+              <w:t>Category the delivered message came from (added 2026-09-07)</w:t>
+            </w:r>
+          </w:p>
+        </w:tc>
+        <w:tc>
+          <w:tcPr>
+            <w:tcW w:type="dxa" w:w="2880"/>
+          </w:tcPr>
+          <w:p>
+            <w:r>
+              <w:t>Null when the arm was control, or when routing failed closed (no match / category exhausted).</w:t>
+            </w:r>
+          </w:p>
+        </w:tc>
+      </w:tr>
+      <w:tr>
+        <w:tc>
+          <w:tcPr>
+            <w:tcW w:type="dxa" w:w="2880"/>
+          </w:tcPr>
+          <w:p>
+            <w:r>
+              <w:t>fallback_reason</w:t>
+            </w:r>
+          </w:p>
+        </w:tc>
+        <w:tc>
+          <w:tcPr>
+            <w:tcW w:type="dxa" w:w="2880"/>
+          </w:tcPr>
+          <w:p>
+            <w:r>
+              <w:t>Why routing did not send from a matched category (added 2026-09-07)</w:t>
+            </w:r>
+          </w:p>
+        </w:tc>
+        <w:tc>
+          <w:tcPr>
+            <w:tcW w:type="dxa" w:w="2880"/>
+          </w:tcPr>
+          <w:p>
+            <w:r>
+              <w:t>'no_category_matched_unhandled' or 'category_exhausted_unhandled' today — both temporary, pending Dr. Chang's answer on the two open edge cases.</w:t>
+            </w:r>
+          </w:p>
+        </w:tc>
+      </w:tr>
     </w:tbl>
     <w:p/>
     <w:p>
@@ -2253,7 +2381,7 @@
         <w:jc w:val="center"/>
       </w:pPr>
       <w:r>
-        <w:t>Last updated: 2026-08-25 · Author: Dustin Nguyen · SMASH Research Lab, UF</w:t>
+        <w:t>Last updated: 2026-09-08 · Author: Dustin Nguyen · SMASH Research Lab, UF</w:t>
       </w:r>
     </w:p>
     <w:sectPr>

</xml_diff>

<commit_message>
Updated docx's and general pool fallback
</commit_message>
<xml_diff>
--- a/Resources/JITAI_Task_Overview.docx
+++ b/Resources/JITAI_Task_Overview.docx
@@ -574,7 +574,7 @@
     <w:p>
       <w:pPr/>
       <w:r>
-        <w:t>Selection rule (full path implemented 2026-09-08):  select_prompt() matches the triggering check-in's B-item answers against ROUTING_TRIGGER_RULES (app/ema_catalog.py), cutoffs confirmed by Dr. Chang 2026-09-07 (scale midpoint+1). Selection is category-first: a matched category is drawn uniformly, then a message uniformly within it, excluding the participant's last 5 delivered prompts. If the drawn category is exhausted by that exclusion, routing redraws among the remaining matched categories (never skips the exclusion, confirmed 2026-09-08); if none remain eligible, or nothing matched at all, it falls through to a general pool, logging 'category_exhausted' or 'no_category_matched'. A separate override sends P020 directly (logged 'closest_fit') when B6_drink_count crosses the gender-specific NIAAA daily limit, ahead of normal category routing. Full rules in Papers/REACT_Routing_Rules_v1.1_2026-09-08.docx. HARD GATE: the general pool is currently 4 fake placeholder IDs (notification_service._GENERAL_FALLBACK_IDS) — must be deleted and replaced with Eliana's real curated list before enrollment (due 2026-09-10, per doc §7).</w:t>
+        <w:t>Selection rule (full path implemented 2026-09-08, gate closed 2026-09-09):  select_prompt() matches the triggering check-in's B-item answers against ROUTING_TRIGGER_RULES (app/ema_catalog.py), cutoffs confirmed by Dr. Chang 2026-09-07 (scale midpoint+1). Selection is category-first: a matched category is drawn uniformly, then a message uniformly within it, excluding the participant's last 5 delivered prompts. If the drawn category is exhausted by that exclusion, routing redraws among the remaining matched categories (never skips the exclusion); if none remain eligible, or nothing matched at all, it falls through to the real general pool (P014, P016, P019, P021, P024 — Eliana Bacal, delivered 2026-09-09), logging 'category_exhausted' or 'no_category_matched'. A separate override sends P020 directly (logged 'closest_fit') when B6_drink_count crosses the gender-specific NIAAA daily limit, ahead of normal category routing. Full rules in Papers/REACT_Routing_Rules_v1.2_2026-09-09.docx — enrollment gate CLOSED. Celebration resolved: no approved content exists for that state, documented as a message-bank finding, not routed around.</w:t>
       </w:r>
     </w:p>
     <w:p>
@@ -2381,7 +2381,7 @@
         <w:jc w:val="center"/>
       </w:pPr>
       <w:r>
-        <w:t>Last updated: 2026-09-08 · Author: Dustin Nguyen · SMASH Research Lab, UF</w:t>
+        <w:t>Last updated: 2026-09-09 · Author: Dustin Nguyen · SMASH Research Lab, UF</w:t>
       </w:r>
     </w:p>
     <w:sectPr>

</xml_diff>

<commit_message>
Added 1 week run-in
</commit_message>
<xml_diff>
--- a/Resources/JITAI_Task_Overview.docx
+++ b/Resources/JITAI_Task_Overview.docx
@@ -403,7 +403,7 @@
           </w:tcPr>
           <w:p>
             <w:r>
-              <w:t>Run eligibility check via apply_decision_rules() — MSSD vs. expanding within-person 80th-percentile threshold; enforce cooldown (60 min) and daily cap (4/day)</w:t>
+              <w:t>Run eligibility check via apply_decision_rules() — MSSD vs. expanding within-person 80th-percentile threshold; enforce cooldown (60 min) and daily cap (4/day). Run-in gate (added 2026-09-21, protocol 9.3): an eligible decision whose EMA falls on study day &lt; RUN_IN_DAYS (7) is forced ineligible (study day is Eastern, anchored to User.enrolled_at; fails closed if enrolled_at is null). The jitai_log row is still written with send_prompt=False, status/delivery_status 'not_sent', trigger_reason 'run-in period', and no randomization draw. Study Day 8 (study_day 7) is the first day a prompt can be sent. Check-ins and check-in reminders are unaffected. Known defect: the daily cap in apply_decision_rules is counted over UTC days, while every other day boundary is Eastern.</w:t>
             </w:r>
           </w:p>
         </w:tc>
@@ -919,7 +919,7 @@
           </w:tcPr>
           <w:p>
             <w:r>
-              <w:t>e.g. "prompt sent", "cooldown active", "below within-person threshold"</w:t>
+              <w:t>e.g. "prompt sent", "cooldown active", "below within-person threshold" (also "run-in period" during study days 1-7, added 2026-09-21)</w:t>
             </w:r>
           </w:p>
         </w:tc>
@@ -2381,7 +2381,7 @@
         <w:jc w:val="center"/>
       </w:pPr>
       <w:r>
-        <w:t>Last updated: 2026-09-09 · Author: Dustin Nguyen · SMASH Research Lab, UF</w:t>
+        <w:t>Last updated: 2026-09-21 · Author: Dustin Nguyen · SMASH Research Lab, UF</w:t>
       </w:r>
     </w:p>
     <w:sectPr>

</xml_diff>

<commit_message>
Add Section 11 distress override with suppression logging
- DistressFlag model and JITAILog.suppression_reason (migration 0048).
- _evaluate_user suppresses before the randomization draw for an active
  baseline or momentary flag, leaving draw, probability and message arm null
  so a suppressed decision point is never mistaken for a dropped prompt.
- Momentary flags fire on exact values: B1_valence == 1, B2_stress == 7,
  B1_affect_sad == 5, B1_affect_anxious == 5; pause 24 hours.
- Baseline flags come from a scored Qualtrics export via
  manage.py import_baseline_distress_flags (participant_id -> user_id);
  scoring gains PHQ-9 self-harm/severity and PGSI problem-gambling flags.
- POST /ema/responses/ returns resource_card (seven study resources);
  mobile EMAScreen shows it.
- Dashboard randomization audit ignores suppressed rows.
- Docs: CLAUDE.md, architecture and JITAI overview docx, new distress
  pipeline docx.
</commit_message>
<xml_diff>
--- a/Resources/JITAI_Task_Overview.docx
+++ b/Resources/JITAI_Task_Overview.docx
@@ -403,7 +403,7 @@
           </w:tcPr>
           <w:p>
             <w:r>
-              <w:t>Run eligibility check via apply_decision_rules() — MSSD vs. expanding within-person 80th-percentile threshold; enforce cooldown (60 min) and daily cap (4/day). Run-in gate (added 2026-09-21, protocol 9.3): an eligible decision whose EMA falls on study day &lt; RUN_IN_DAYS (7) is forced ineligible (study day is Eastern, anchored to User.enrolled_at; fails closed if enrolled_at is null). The jitai_log row is still written with send_prompt=False, status/delivery_status 'not_sent', trigger_reason 'run-in period', and no randomization draw. Study Day 8 (study_day 7) is the first day a prompt can be sent. Check-ins and check-in reminders are unaffected. Known defect: the daily cap in apply_decision_rules is counted over UTC days, while every other day boundary is Eastern.</w:t>
+              <w:t>Run eligibility check via apply_decision_rules() — MSSD vs. expanding within-person 80th-percentile threshold; enforce cooldown (60 min) and daily cap (4/day). Suppression gates (added 2026-09-21): an engine-eligible decision is then checked, in this order, against (a) the run-in gate (protocol 9.3) — the EMA falls on study day &lt; RUN_IN_DAYS (7); study day is Eastern, anchored to User.enrolled_at, and fails closed if enrolled_at is null — and (b) the distress override (protocol Section 11) — the participant has an active DistressFlag, baseline named ahead of momentary. Either forces the decision ineligible before the randomization draw; run-in wins when both apply. Suppression only applies to decisions the engine judged eligible; ineligible decisions keep the engine's own reason. The jitai_log row is still written with send_prompt=False, status/delivery_status 'not_sent', randomization_draw, randomization_probability and message_arm all null, suppression_reason 'run_in' / 'distress_baseline' / 'distress_momentary', and trigger_reason 'run-in period' / 'distress override (baseline)' / 'distress override (momentary)'. Study Day 8 (study_day 7) is the first day a prompt can be sent. Check-ins and check-in reminders are unaffected. The dashboard randomization audit ignores rows with a suppression_reason. Known defect: the daily cap in apply_decision_rules is counted over UTC days, while every other day boundary is Eastern.</w:t>
             </w:r>
           </w:p>
         </w:tc>
@@ -586,7 +586,7 @@
     <w:p>
       <w:pPr/>
       <w:r>
-        <w:t>Both the eligible pool (eligible_prompt_ids) and the drawn prompt (prompt_id) are recorded on the jitai_log row at every eligible decision point, sent or not. Note on terminology: 'control arm' below in section 5 now means the active-control arm (message_arm='control') — a real neutral message IS sent. That's distinct from send_prompt=False, which means no message was sent at all (either ineligible, or the first-stage draw said no) — don't conflate the two when reading section 4's field table.</w:t>
+        <w:t>Both the eligible pool (eligible_prompt_ids) and the drawn prompt (prompt_id) are recorded on the jitai_log row at every eligible decision point, sent or not. Note on terminology: 'control arm' below in section 5 now means the active-control arm (message_arm='control') — a real neutral message IS sent. That's distinct from send_prompt=False, which means no message was sent at all (either ineligible or suppressed by the run-in / distress override, or the first-stage draw said no) — don't conflate the two when reading section 4's field table.</w:t>
       </w:r>
     </w:p>
     <w:p>
@@ -601,6 +601,26 @@
       <w:pPr/>
       <w:r>
         <w:t>Added 2026-08-25, per REACT_IRB01_StudyTeam_Measures_v2.docx Part 2. After any delivered prompt (coping or active-control arm), GET /ema/next/ offers a 'prompt_feedback' EMA (item C0: 'Was this message helpful right now?' / 'Did it change what you did next?') ahead of the outcome-window survey, keyed by source_jitai_log. Reuses EMA/EMAItemResponse — no new table. Submitting with an empty responses list records status='dismissed' rather than 'completed', so a skip is recorded as missing, not a negative answer. This is the study's pre-registered prompt-response-rate benchmark — Dr. Chang flagged it as the proximal outcome measure, build-now priority.</w:t>
+      </w:r>
+    </w:p>
+    <w:p>
+      <w:pPr>
+        <w:pStyle w:val="Heading2"/>
+      </w:pPr>
+      <w:r>
+        <w:t>3c. Distress Override (Section 11)</w:t>
+      </w:r>
+    </w:p>
+    <w:p>
+      <w:pPr/>
+      <w:r>
+        <w:t>Added 2026-09-21, protocol Section 11. Built in code (backend/app/distress.py, DistressFlag model, migration 0048) and checked inside _evaluate_user after the run-in gate and before the randomization draw. An active flag suspends randomization: the decision is logged with send_prompt=False, suppression_reason 'distress_baseline' or 'distress_momentary', and null draw/probability/arm (baseline is named ahead of momentary when both are active; run-in wins over both). Baseline flags come from the Qualtrics baseline screens with signal codes phq9_self_harm, phq9_severity, scoff, audit_c, problem_gambling, food_insecurity and free_text_risk (codes only — never a score or free text), and pause prompts until staff document same-day contact via the Django Admin action 'Mark same-day contact documented'; randomization then resumes. Momentary flags are raised when a submitted check-in has ANY of B1_valence == 1, B2_stress == 7, B1_affect_sad == 5 or B1_affect_anxious == 5 — exact values, not thresholds, confirmed by Dr. Chang 2026-09-22 (DISTRESS_B1_VALENCE_FLOOR=1, DISTRESS_B2_STRESS_CEILING=7, DISTRESS_B1_AFFECT_CEILING=5 in dashboard/data/config.py) — and pause prompts for DISTRESS_MOMENTARY_PAUSE_HOURS (24). Signal codes are b1_low_valence, b2_high_stress, b1_affect_sad and b1_affect_anxious; several can fire on one check-in and all are recorded. Skipped items never fire, and out-of-range values are rejected by the serializer before storage. This is separate from the ROUTING_TRIGGER_RULES inequality cutoffs used for coping-message topic selection. POST /ema/responses/ returns a resource_card ({title, message, resources[]}), null when no override is active, after any check-in submitted under an active override;  the mobile EMA modal shows it in a 'resources' phase with a Done button and tap-to-call. The card message opens with the 911 instruction, and RESOURCE_CARD_RESOURCES holds the seven resources from the study's resource document (Campus Counseling Center, 988 Suicide and Crisis Lifeline, Hitchcock Field &amp; Fork Pantry, National Alliance for Eating Disorders Helpline, SAMHSA National Helpline, National Problem Gambling Helpline, Florida's Gambling Helpline) with digits-only contacts for tap-to-call. Decisions by Dr. Chang 2026-09-23: staff alerts come from Qualtrics (it emails the PI and staff when a flagged baseline is submitted), not the backend, and the import only suppresses; contact_documented_at is a timestamp only, with who called and what was given kept in the staff contact log outside Django; staff mark a baseline flag documented in Django Admin (same day for the two PHQ-9 flags, at the next visit for alcohol/eating/gambling/food), and an unmarked flag suppresses that participant for the rest of the study by design; in-app (momentary) flags are resource-card-only with no staff notice; free_text_risk stays a manual Admin flag.</w:t>
+      </w:r>
+    </w:p>
+    <w:p>
+      <w:pPr/>
+      <w:r>
+        <w:t>Baseline flags can be ingested in bulk via `manage.py import_baseline_distress_flags --file &lt;path&gt; [--dry-run]` (--id-column defaults to participant_id and --id-field defaults to user_id, since the export's participant_id is the numeric User.user_id; both are overridable), which scores a Qualtrics export and maps it to six of the seven signal codes above — all but free_text_risk, which has no source column in this pipeline (analytics/baseline_survey_scoring/section11.py) — and skips any row whose exact signal set is already on record for that user. Still open: (1) the import has not been run on a real export (it waits for the RS01-RS04 accounts); (2) the mobile resource screen must be tested on iPhone and Android and shipped to all participants before Day 8 (2026-09-28); (3) the backend and migration 0048 must be deployed first; (4) the backend cannot see the app version, so old builds are suppressed but show no card.</w:t>
       </w:r>
     </w:p>
     <w:p>
@@ -791,7 +811,7 @@
           </w:tcPr>
           <w:p>
             <w:r>
-              <w:t>Read from JITAI_RANDOMIZATION_PROBABILITY env var</w:t>
+              <w:t>Read from JITAI_RANDOMIZATION_PROBABILITY env var. Null on suppressed rows (suppression_reason set), added 2026-09-21</w:t>
             </w:r>
           </w:p>
         </w:tc>
@@ -823,7 +843,7 @@
           </w:tcPr>
           <w:p>
             <w:r>
-              <w:t>Null when participant was not eligible</w:t>
+              <w:t>Null when participant was not eligible, or when the decision was suppressed (run-in / distress override)</w:t>
             </w:r>
           </w:p>
         </w:tc>
@@ -855,7 +875,7 @@
           </w:tcPr>
           <w:p>
             <w:r>
-              <w:t>True = a message was sent (either arm). False = nothing sent — either ineligible or the first-stage draw said no. Do not read False as 'control arm' — see message_arm.</w:t>
+              <w:t>True = a message was sent (either arm). False = nothing sent — either ineligible, suppressed by the run-in / distress override, or the first-stage draw said no. Do not read False as 'control arm' — see message_arm.</w:t>
             </w:r>
           </w:p>
         </w:tc>
@@ -919,7 +939,7 @@
           </w:tcPr>
           <w:p>
             <w:r>
-              <w:t>e.g. "prompt sent", "cooldown active", "below within-person threshold" (also "run-in period" during study days 1-7, added 2026-09-21)</w:t>
+              <w:t>e.g. "prompt sent", "cooldown active", "below within-person threshold" (also, added 2026-09-21: "run-in period" during study days 1-7; "distress override (baseline)" / "distress override (momentary)" while a distress flag is active)</w:t>
             </w:r>
           </w:p>
         </w:tc>
@@ -1731,6 +1751,38 @@
           </w:p>
         </w:tc>
       </w:tr>
+      <w:tr>
+        <w:tc>
+          <w:tcPr>
+            <w:tcW w:type="dxa" w:w="2880"/>
+          </w:tcPr>
+          <w:p>
+            <w:r>
+              <w:t>suppression_reason</w:t>
+            </w:r>
+          </w:p>
+        </w:tc>
+        <w:tc>
+          <w:tcPr>
+            <w:tcW w:type="dxa" w:w="2880"/>
+          </w:tcPr>
+          <w:p>
+            <w:r>
+              <w:t>Suppression audit (added 2026-09-21)</w:t>
+            </w:r>
+          </w:p>
+        </w:tc>
+        <w:tc>
+          <w:tcPr>
+            <w:tcW w:type="dxa" w:w="2880"/>
+          </w:tcPr>
+          <w:p>
+            <w:r>
+              <w:t>'run_in', 'distress_baseline' or 'distress_momentary' when an engine-eligible decision was withheld before the randomization draw; blank otherwise. Run-in takes precedence, then distress (baseline ahead of momentary). Such rows carry randomization_draw, randomization_probability and message_arm = null, and the dashboard randomization audit ignores them, so they are not mistaken for dropped prompts (migration 0048).</w:t>
+            </w:r>
+          </w:p>
+        </w:tc>
+      </w:tr>
     </w:tbl>
     <w:p/>
     <w:p>
@@ -2164,7 +2216,7 @@
           </w:tcPr>
           <w:p>
             <w:r>
-              <w:t>send_prompt=False (ineligible, or first-stage draw said no)</w:t>
+              <w:t>send_prompt=False (ineligible, suppressed by run-in / distress override, or first-stage draw said no)</w:t>
             </w:r>
           </w:p>
         </w:tc>
@@ -2381,7 +2433,7 @@
         <w:jc w:val="center"/>
       </w:pPr>
       <w:r>
-        <w:t>Last updated: 2026-09-21 · Author: Dustin Nguyen · SMASH Research Lab, UF</w:t>
+        <w:t>Last updated: 2026-09-23 · Author: Dustin Nguyen · SMASH Research Lab, UF</w:t>
       </w:r>
     </w:p>
     <w:sectPr>

</xml_diff>

<commit_message>
Make POST /jitai/ staff-only and re-enforce protocol safeguards on it
Nothing in the real pipeline calls /jitai/ over HTTP -- _evaluate_user writes
JITAILog rows via the ORM directly -- so it's now gated by IsAdminUser. Since
a direct POST has no MSSD decision frame to have already enforced run-in,
distress override, cooldown or the daily cap, JITAILogView.post re-checks all
four via a new _decision_point_safeguards (app/tasks.py), sharing the run-in +
distress logic with _evaluate_user's own _protocol_override_reason. Adds
'cooldown' and 'daily_cap' as JITAILog.suppression_reason choices (migration
0050) for decisions this recheck suppresses that _evaluate_user's upstream
MSSD-frame checks would never produce on their own.
</commit_message>
<xml_diff>
--- a/Resources/JITAI_Task_Overview.docx
+++ b/Resources/JITAI_Task_Overview.docx
@@ -621,6 +621,20 @@
       <w:pPr/>
       <w:r>
         <w:t>Baseline flags can be ingested in bulk, by hand (there is no schedule), through either of two front ends that share one function, import_baseline_flags in backend/app/baseline_import.py: `manage.py import_baseline_distress_flags --file &lt;path&gt; [--dry-run]` (--id-column defaults to participant_id and --id-field defaults to user_id, since the export's participant_id is the numeric User.user_id; both are overridable), which scores a Qualtrics export and maps it to six of the seven signal codes above — all but free_text_risk, which has no source column in this pipeline (analytics/baseline_survey_scoring/section11.py) — and skips any row whose exact signal set is already on record for that user. The second front end is the 'Import baseline export' button on Django Admin &gt; Distress flags (DistressFlagAdmin.import_baseline_view), which lets staff run the import without a shell or database access. Staff with the add-flag permission upload the Qualtrics export as a CSV (5 MB cap; .xlsx is not supported); the file is read in memory and never saved, and only signal codes are stored. The page previews by default (nothing is written) and lists what would be created, rows already on record, rows with a blank screening item, unrecognized columns and unmatched participant IDs. To write, staff choose the file again, uncheck 'Preview only' and submit. The write is refused if any screening instrument's items (PHQ-9, SCOFF, AUDIT-C, PGSI, Hunger Vital Sign) are missing from the export, because nobody could be flagged on that screen; creation is all-or-nothing, and every flag created gets a Django Admin log entry showing who imported it. The export is read by qualtrics.read_export (a path or file-like object; returns the frame plus diagnostics), which load_export wraps. Still open: (1) the import has not been run on a real export (it waits for the RS01-RS04 accounts); (2) the mobile resource screen must be tested on iPhone and Android and shipped to all participants before Day 8 (2026-09-28); (3) the backend and migrations 0049 (app) and 0005 (dashboard) must be deployed first; (4) the backend cannot see the app version, so old builds are suppressed but show no card.</w:t>
+      </w:r>
+    </w:p>
+    <w:p>
+      <w:pPr>
+        <w:pStyle w:val="Heading2"/>
+      </w:pPr>
+      <w:r>
+        <w:t>3d. External Decision-Point Safeguard (POST /jitai/)</w:t>
+      </w:r>
+    </w:p>
+    <w:p>
+      <w:pPr/>
+      <w:r>
+        <w:t>Added 2026-09-30. POST /jitai/ was previously an unauthenticated internal path; evaluate_jitai_triggers has never called it — it writes jitai_log rows directly via the ORM (get_or_create on decision_point_id, section 5.2). The endpoint is now staff-only (IsAdminUser) for POST, and before saving it independently reruns the same protocol guards through _decision_point_safeguards (backend/app/tasks.py): run-in, then an active distress override, then a 60-minute cooldown since the user's last send_prompt=True row, then the daily cap, in that order. If any guard fails, the submitted row is overwritten before save — send_prompt=False, status and delivery_status='suppressed', randomization_probability and randomization_draw forced null, and suppression_reason set to the failing guard: 'run_in', 'distress_baseline', 'distress_momentary', 'cooldown' or 'daily_cap' (migration 0050; the latter two never appear on rows written by evaluate_jitai_triggers itself). The mobile app's dev-only 'simulate JITAI push' action (ComposeScreen) called this endpoint as a logged-in participant; that call now needs staff auth to succeed.</w:t>
       </w:r>
     </w:p>
     <w:p>
@@ -1778,7 +1792,7 @@
           </w:tcPr>
           <w:p>
             <w:r>
-              <w:t>'run_in', 'distress_baseline' or 'distress_momentary' when an engine-eligible decision was withheld before the randomization draw; blank otherwise. Run-in takes precedence, then distress (baseline ahead of momentary). Such rows carry status and delivery_status = 'suppressed' (relabeled from 'not_sent' 2026-09-24, migration 0049, which also backfilled existing rows and set suppression_reason='run_in' on legacy 'run-in period' rows), and randomization_draw, randomization_probability and message_arm = null; the JITAI API serializer exposes suppression_reason read-only, and the dashboard randomization audit ignores them, so they are not mistaken for dropped prompts (migration 0048).</w:t>
+              <w:t>'run_in', 'distress_baseline' or 'distress_momentary' when an engine-eligible decision was withheld before the randomization draw; blank otherwise. Run-in takes precedence, then distress (baseline ahead of momentary). Such rows carry status and delivery_status = 'suppressed' (relabeled from 'not_sent' 2026-09-24, migration 0049, which also backfilled existing rows and set suppression_reason='run_in' on legacy 'run-in period' rows), and randomization_draw, randomization_probability and message_arm = null; the JITAI API serializer exposes suppression_reason read-only, and the dashboard randomization audit ignores them, so they are not mistaken for dropped prompts (migration 0048). Added 2026-09-30 (migration 0050): 'cooldown' and 'daily_cap' are two further choices, produced only by POST /jitai/'s own safeguard recheck (section 3d) on a staff-submitted row outside the normal Celery flow — evaluate_jitai_triggers itself never writes these two, since cooldown/daily-cap are already enforced upstream via apply_decision_rules on the MSSD frame (step 5 above).</w:t>
             </w:r>
           </w:p>
         </w:tc>
@@ -2433,7 +2447,7 @@
         <w:jc w:val="center"/>
       </w:pPr>
       <w:r>
-        <w:t>Last updated: 2026-09-24 · Author: Dustin Nguyen · SMASH Research Lab, UF</w:t>
+        <w:t>Last updated: 2026-09-30 · Author: Dustin Nguyen · SMASH Research Lab, UF</w:t>
       </w:r>
     </w:p>
     <w:sectPr>

</xml_diff>

<commit_message>
Changed the baseline matching questions and Updated docxs.
</commit_message>
<xml_diff>
--- a/Resources/JITAI_Task_Overview.docx
+++ b/Resources/JITAI_Task_Overview.docx
@@ -403,7 +403,7 @@
           </w:tcPr>
           <w:p>
             <w:r>
-              <w:t>Run eligibility check via apply_decision_rules() — MSSD vs. expanding within-person 80th-percentile threshold; enforce cooldown (60 min) and daily cap (4/day). Suppression gates (added 2026-09-21): an engine-eligible decision is then checked, in this order, against (a) the run-in gate (protocol 9.3) — the EMA falls on study day &lt; RUN_IN_DAYS (7); study day is Eastern, anchored to User.enrolled_at, and fails closed if enrolled_at is null — and (b) the distress override (protocol Section 11) — the participant has an active DistressFlag, baseline named ahead of momentary. Either forces the decision ineligible before the randomization draw; run-in wins when both apply. Suppression only applies to decisions the engine judged eligible; ineligible decisions keep the engine's own reason. The jitai_log row is still written with send_prompt=False, status and delivery_status both 'suppressed' (added 2026-09-24, migration 0049; 'not_sent' now remains only for ordinary ineligible decisions and eligible decisions the randomization did not send), randomization_draw, randomization_probability and message_arm all null, suppression_reason 'run_in' / 'distress_baseline' / 'distress_momentary', and trigger_reason 'run-in period' / 'distress override (baseline)' / 'distress override (momentary)'. Study Day 8 (study_day 7) is the first day a prompt can be sent. Check-ins and check-in reminders are unaffected. The dashboard randomization audit ignores rows with a suppression_reason. The monitoring layer counts them in MetricsDaily.suppressed_n (added 2026-09-24, dashboard migration 0005); they stay in decision_points_n and outside eligible_n, and the participant timeline labels them 'suppressed (run-in)' / 'suppressed (distress)'. Known defect: the daily cap in apply_decision_rules is counted over UTC days, while every other day boundary is Eastern.</w:t>
+              <w:t>Run eligibility check via apply_decision_rules() — MSSD vs. expanding within-person 80th-percentile threshold; apply_decision_rules also internally simulates a 60-minute cooldown and a 4/day cap, but as of 2026-10-01 production reads its decision_reason only as an MSSD-threshold verdict (MSSD_ELIGIBLE_REASONS in tasks.py treats 'prompt sent' / 'cooldown active' / 'daily cap reached' alike) — real cooldown/cap enforcement is a separate check, gate (c) below. Suppression gates (run-in and distress added 2026-09-21; cooldown/daily-cap added 2026-10-01): an MSSD-eligible decision is then checked, in this order, against (a) the run-in gate (protocol 9.3) — the EMA falls on study day &lt; RUN_IN_DAYS (7); study day is Eastern, anchored to User.enrolled_at, and fails closed if enrolled_at is null — (b) the distress override (protocol Section 11) — the participant has an active DistressFlag, baseline named ahead of momentary — and (c) the real cooldown/daily-cap check: a 60-minute cooldown and a 4/day cap counted against actual JITAILog(send_prompt=True) rows on the participant's Eastern calendar day (dashboard/data/windows.py::participant_day_bounds, via the shared _cooldown_cap_reason helper also used by POST /jitai/'s own safeguard recheck), replacing reliance on apply_decision_rules's own internal, UTC-day cap/cooldown simulation. Any of the three forces the decision ineligible before the randomization draw, in that same precedence order when more than one applies. Suppression only applies to decisions that passed the MSSD-threshold gate (decision_reason in MSSD_ELIGIBLE_REASONS); decisions that failed it keep the engine's own reason. The jitai_log row is still written with send_prompt=False, status and delivery_status both 'suppressed' (added 2026-09-24, migration 0049; 'not_sent' now remains only for ordinary ineligible decisions and eligible decisions the randomization did not send), randomization_draw, randomization_probability and message_arm all null, suppression_reason 'run_in' / 'distress_baseline' / 'distress_momentary' / 'cooldown' / 'daily_cap', and trigger_reason 'run-in period' / 'distress override (baseline)' / 'distress override (momentary)' / 'cooldown active' / 'daily cap reached'. Study Day 8 (study_day 7) is the first day a prompt can be sent. Check-ins and check-in reminders are unaffected. The dashboard randomization audit ignores rows with a suppression_reason. The monitoring layer counts them in MetricsDaily.suppressed_n (added 2026-09-24, dashboard migration 0005); they stay in decision_points_n and outside eligible_n, and the participant timeline labels them 'suppressed (run-in)' / 'suppressed (distress)'. Fixed 2026-10-01: apply_decision_rules's own internal cap/cooldown simulation still counts UTC days (documented in production_schema.md; harmless for its only remaining consumer, the synthetic-data/sensitivity-analysis pipeline), but production no longer relies on that verdict — real enforcement is the Eastern-day _cooldown_cap_reason check, gate (c) above.</w:t>
             </w:r>
           </w:p>
         </w:tc>
@@ -634,7 +634,7 @@
     <w:p>
       <w:pPr/>
       <w:r>
-        <w:t>Added 2026-09-30. POST /jitai/ was previously an unauthenticated internal path; evaluate_jitai_triggers has never called it — it writes jitai_log rows directly via the ORM (get_or_create on decision_point_id, section 5.2). The endpoint is now staff-only (IsAdminUser) for POST, and before saving it independently reruns the same protocol guards through _decision_point_safeguards (backend/app/tasks.py): run-in, then an active distress override, then a 60-minute cooldown since the user's last send_prompt=True row, then the daily cap, in that order. If any guard fails, the submitted row is overwritten before save — send_prompt=False, status and delivery_status='suppressed', randomization_probability and randomization_draw forced null, and suppression_reason set to the failing guard: 'run_in', 'distress_baseline', 'distress_momentary', 'cooldown' or 'daily_cap' (migration 0050; the latter two never appear on rows written by evaluate_jitai_triggers itself). The mobile app's dev-only 'simulate JITAI push' action (ComposeScreen) called this endpoint as a logged-in participant; that call now needs staff auth to succeed.</w:t>
+        <w:t>Added 2026-09-30. POST /jitai/ was previously an unauthenticated internal path; evaluate_jitai_triggers has never called it — it writes jitai_log rows directly via the ORM (get_or_create on decision_point_id, section 5.2). The endpoint is now staff-only (IsAdminUser) for POST, and before saving it independently reruns the same protocol guards through _decision_point_safeguards (backend/app/tasks.py): run-in and distress via _protocol_override_reason, then cooldown and daily cap via the shared _cooldown_cap_reason helper — a 60-minute cooldown and a 4/day cap counted against actual JITAILog(send_prompt=True) rows on the participant's Eastern calendar day, in that order. Fixed 2026-10-01: _cooldown_cap_reason replaces this endpoint's own previously-independent, UTC-day cooldown/cap query, and is now also shared with evaluate_jitai_triggers itself (section 3, step 5). If any guard fails, the submitted row is overwritten before save — send_prompt=False, status and delivery_status='suppressed', randomization_probability and randomization_draw forced null, and suppression_reason set to the failing guard: 'run_in', 'distress_baseline', 'distress_momentary', 'cooldown' or 'daily_cap' (migration 0050; as of 2026-10-01 all four reasons, including 'cooldown'/'daily_cap', can also be produced by evaluate_jitai_triggers itself via the same shared _cooldown_cap_reason check). The mobile app's dev-only 'simulate JITAI push' action (ComposeScreen) called this endpoint as a logged-in participant; that call now needs staff auth to succeed.</w:t>
       </w:r>
     </w:p>
     <w:p>
@@ -953,7 +953,7 @@
           </w:tcPr>
           <w:p>
             <w:r>
-              <w:t>e.g. "prompt sent", "cooldown active", "below within-person threshold" (also, added 2026-09-21: "run-in period" during study days 1-7; "distress override (baseline)" / "distress override (momentary)" while a distress flag is active)</w:t>
+              <w:t>e.g. "prompt sent", "cooldown active", "below within-person threshold" (also, added 2026-09-21: "run-in period" during study days 1-7; "distress override (baseline)" / "distress override (momentary)" while a distress flag is active) Fixed 2026-10-01: "cooldown active" and "daily cap reached" now reflect the real _cooldown_cap_reason check (actual send history, Eastern calendar days) rather than apply_decision_rules's own internal, UTC-day simulation, which production now reads only as "MSSD gate passed" (MSSD_ELIGIBLE_REASONS in tasks.py).</w:t>
             </w:r>
           </w:p>
         </w:tc>
@@ -1792,7 +1792,7 @@
           </w:tcPr>
           <w:p>
             <w:r>
-              <w:t>'run_in', 'distress_baseline' or 'distress_momentary' when an engine-eligible decision was withheld before the randomization draw; blank otherwise. Run-in takes precedence, then distress (baseline ahead of momentary). Such rows carry status and delivery_status = 'suppressed' (relabeled from 'not_sent' 2026-09-24, migration 0049, which also backfilled existing rows and set suppression_reason='run_in' on legacy 'run-in period' rows), and randomization_draw, randomization_probability and message_arm = null; the JITAI API serializer exposes suppression_reason read-only, and the dashboard randomization audit ignores them, so they are not mistaken for dropped prompts (migration 0048). Added 2026-09-30 (migration 0050): 'cooldown' and 'daily_cap' are two further choices, produced only by POST /jitai/'s own safeguard recheck (section 3d) on a staff-submitted row outside the normal Celery flow — evaluate_jitai_triggers itself never writes these two, since cooldown/daily-cap are already enforced upstream via apply_decision_rules on the MSSD frame (step 5 above).</w:t>
+              <w:t>'run_in', 'distress_baseline' or 'distress_momentary' when an engine-eligible decision was withheld before the randomization draw; blank otherwise. Run-in takes precedence, then distress (baseline ahead of momentary). Such rows carry status and delivery_status = 'suppressed' (relabeled from 'not_sent' 2026-09-24, migration 0049, which also backfilled existing rows and set suppression_reason='run_in' on legacy 'run-in period' rows), and randomization_draw, randomization_probability and message_arm = null; the JITAI API serializer exposes suppression_reason read-only, and the dashboard randomization audit ignores them, so they are not mistaken for dropped prompts (migration 0048). Added 2026-09-30 (migration 0050): 'cooldown' and 'daily_cap' are two further choices. Fixed 2026-10-01: both evaluate_jitai_triggers (step 5 above) and POST /jitai/'s own safeguard recheck (section 3d) can write them, via the single shared _cooldown_cap_reason helper — real JITAILog(send_prompt=True) history on the participant's Eastern calendar day. Previously evaluate_jitai_triggers trusted apply_decision_rules's own internal, UTC-day cap/cooldown simulation instead of real send history, and POST /jitai/'s recheck had its own separate, also-UTC-day query — both were defects, now fixed by the shared helper.</w:t>
             </w:r>
           </w:p>
         </w:tc>
@@ -1833,7 +1833,7 @@
     </w:p>
     <w:p>
       <w:r>
-        <w:t>Both p and the draw are logged in jitai_log before any push is sent, so the randomization record is complete and auditable even if delivery subsequently fails.</w:t>
+        <w:t>Both p and the draw are logged in jitai_log before any push is sent, so the randomization record is complete and auditable even if delivery subsequently fails. As of 2026-10-01, the task layer reads apply_decision_rules's decision_reason only for the MSSD-threshold verdict (MSSD_ELIGIBLE_REASONS in tasks.py) — real cooldown/daily-cap enforcement is a separate, later check against actual send history on Eastern calendar days (_cooldown_cap_reason; see section 3d), not part of apply_decision_rules's own output.</w:t>
       </w:r>
     </w:p>
     <w:p>
@@ -2447,7 +2447,7 @@
         <w:jc w:val="center"/>
       </w:pPr>
       <w:r>
-        <w:t>Last updated: 2026-09-30 · Author: Dustin Nguyen · SMASH Research Lab, UF</w:t>
+        <w:t>Last updated: 2026-10-01 · Author: Dustin Nguyen · SMASH Research Lab, UF</w:t>
       </w:r>
     </w:p>
     <w:sectPr>

</xml_diff>

<commit_message>
New test + Documentation updates
</commit_message>
<xml_diff>
--- a/Resources/JITAI_Task_Overview.docx
+++ b/Resources/JITAI_Task_Overview.docx
@@ -601,6 +601,12 @@
       <w:pPr/>
       <w:r>
         <w:t>Added 2026-08-25, per REACT_IRB01_StudyTeam_Measures_v2.docx Part 2. After any delivered prompt (coping or active-control arm), GET /ema/next/ offers a 'prompt_feedback' EMA (item C0: 'Was this message helpful right now?' / 'Did it change what you did next?') ahead of the outcome-window survey, keyed by source_jitai_log. Reuses EMA/EMAItemResponse — no new table. Submitting with an empty responses list records status='dismissed' rather than 'completed', so a skip is recorded as missing, not a negative answer. This is the study's pre-registered prompt-response-rate benchmark — Dr. Chang flagged it as the proximal outcome measure, build-now priority.</w:t>
+      </w:r>
+    </w:p>
+    <w:p>
+      <w:pPr/>
+      <w:r>
+        <w:t>Changed 2026-10-03: the 2-hour outcome-window survey (post_prompt / extra_check_in) now opens at every randomized decision point (JITAILog.randomization_draw not null), both arms, whether or not a prompt was sent. Anchor is push_sent_at for a sent prompt and triggered_at for an unsent decision. Suppressed rows (run-in, distress, cooldown, daily cap; draw null) open no window. The C0 prompt_feedback check-in above is still offered only after a delivered prompt. Cooldown/daily-cap enforcement and the reminder logic (still skipped during any active window) are unchanged.</w:t>
       </w:r>
     </w:p>
     <w:p>

</xml_diff>

<commit_message>
Update JITAI overview and architecture docs for Expo receipt tracking and study-ID labels
</commit_message>
<xml_diff>
--- a/Resources/JITAI_Task_Overview.docx
+++ b/Resources/JITAI_Task_Overview.docx
@@ -1437,7 +1437,7 @@
           <w:p>
             <w:pPr/>
             <w:r>
-              <w:t>pending / not_sent / suppressed / accepted_by_expo / received_on_device / failed. Set alongside status by notification_service.py.</w:t>
+              <w:t>pending / not_sent / suppressed / accepted_by_expo / handed_to_provider / received_on_device / failed. Set alongside status by notification_service.py; handed_to_provider is set later by check_expo_receipts (added 2026-10-08).</w:t>
             </w:r>
           </w:p>
         </w:tc>
@@ -1472,7 +1472,147 @@
           <w:p>
             <w:pPr/>
             <w:r>
-              <w:t>Expo/ticket exception text, truncated to 2000 chars; blank unless delivery_status = failed.</w:t>
+              <w:t>Expo/ticket exception text, truncated to 2000 chars; blank unless delivery_status = failed. Receipt failures are stored as 'expo receipt: &lt;code&gt;' (added 2026-10-08).</w:t>
+            </w:r>
+          </w:p>
+        </w:tc>
+      </w:tr>
+      <w:tr>
+        <w:tc>
+          <w:tcPr>
+            <w:tcW w:type="dxa" w:w="2880"/>
+          </w:tcPr>
+          <w:p>
+            <w:pPr/>
+            <w:r>
+              <w:t>expo_ticket_id</w:t>
+            </w:r>
+          </w:p>
+        </w:tc>
+        <w:tc>
+          <w:tcPr>
+            <w:tcW w:type="dxa" w:w="2880"/>
+          </w:tcPr>
+          <w:p>
+            <w:pPr/>
+            <w:r>
+              <w:t>Expo ticket (added 2026-10-08)</w:t>
+            </w:r>
+          </w:p>
+        </w:tc>
+        <w:tc>
+          <w:tcPr>
+            <w:tcW w:type="dxa" w:w="2880"/>
+          </w:tcPr>
+          <w:p>
+            <w:pPr/>
+            <w:r>
+              <w:t>Ticket ID Expo returns for the push; blank for rows with no ticket. Used by check_expo_receipts.</w:t>
+            </w:r>
+          </w:p>
+        </w:tc>
+      </w:tr>
+      <w:tr>
+        <w:tc>
+          <w:tcPr>
+            <w:tcW w:type="dxa" w:w="2880"/>
+          </w:tcPr>
+          <w:p>
+            <w:pPr/>
+            <w:r>
+              <w:t>expo_receipt_status</w:t>
+            </w:r>
+          </w:p>
+        </w:tc>
+        <w:tc>
+          <w:tcPr>
+            <w:tcW w:type="dxa" w:w="2880"/>
+          </w:tcPr>
+          <w:p>
+            <w:pPr/>
+            <w:r>
+              <w:t>Expo receipt (added 2026-10-08)</w:t>
+            </w:r>
+          </w:p>
+        </w:tc>
+        <w:tc>
+          <w:tcPr>
+            <w:tcW w:type="dxa" w:w="2880"/>
+          </w:tcPr>
+          <w:p>
+            <w:pPr/>
+            <w:r>
+              <w:t>ok / error, as read from Expo's receipt; blank until checked.</w:t>
+            </w:r>
+          </w:p>
+        </w:tc>
+      </w:tr>
+      <w:tr>
+        <w:tc>
+          <w:tcPr>
+            <w:tcW w:type="dxa" w:w="2880"/>
+          </w:tcPr>
+          <w:p>
+            <w:pPr/>
+            <w:r>
+              <w:t>expo_receipt_error</w:t>
+            </w:r>
+          </w:p>
+        </w:tc>
+        <w:tc>
+          <w:tcPr>
+            <w:tcW w:type="dxa" w:w="2880"/>
+          </w:tcPr>
+          <w:p>
+            <w:pPr/>
+            <w:r>
+              <w:t>Expo receipt (added 2026-10-08)</w:t>
+            </w:r>
+          </w:p>
+        </w:tc>
+        <w:tc>
+          <w:tcPr>
+            <w:tcW w:type="dxa" w:w="2880"/>
+          </w:tcPr>
+          <w:p>
+            <w:pPr/>
+            <w:r>
+              <w:t>Receipt error code (e.g. DeviceNotRegistered); blank unless the receipt was an error.</w:t>
+            </w:r>
+          </w:p>
+        </w:tc>
+      </w:tr>
+      <w:tr>
+        <w:tc>
+          <w:tcPr>
+            <w:tcW w:type="dxa" w:w="2880"/>
+          </w:tcPr>
+          <w:p>
+            <w:pPr/>
+            <w:r>
+              <w:t>expo_receipt_checked_at</w:t>
+            </w:r>
+          </w:p>
+        </w:tc>
+        <w:tc>
+          <w:tcPr>
+            <w:tcW w:type="dxa" w:w="2880"/>
+          </w:tcPr>
+          <w:p>
+            <w:pPr/>
+            <w:r>
+              <w:t>Expo receipt (added 2026-10-08)</w:t>
+            </w:r>
+          </w:p>
+        </w:tc>
+        <w:tc>
+          <w:tcPr>
+            <w:tcW w:type="dxa" w:w="2880"/>
+          </w:tcPr>
+          <w:p>
+            <w:pPr/>
+            <w:r>
+              <w:t>When check_expo_receipts last read the receipt; null until checked.</w:t>
             </w:r>
           </w:p>
         </w:tc>
@@ -2079,6 +2219,9 @@
         <w:br/>
         <w:br/>
         <w:t>Retry policy (confirmed by Dr. Chang, 2026-07-06): one immediate retry is attempted for transient Expo server or ticket errors. No delayed redelivery. DeviceNotRegisteredError clears the push token and does not retry. All failed rows are retained in jitai_log for analysis (failure rate is a reported metric in the study paper).</w:t>
+        <w:br/>
+        <w:br/>
+        <w:t>Expo receipt check (added 2026-10-08): send_jitai_prompt saves Expo's ticket ID on jitai_log.expo_ticket_id for every JITAI push (check-in reminders do not store a ticket). A separate Celery Beat task, check_expo_receipts (every 180 s, app/tasks.py), asks Expo for the receipt between 15 minutes and 23 hours after the send. An 'ok' receipt moves delivery_status from accepted_by_expo to handed_to_provider (Apple/Google accepted the push; this is not proof the participant saw it). An error receipt sets delivery_status = failed with delivery_error = 'expo receipt: &lt;code&gt;', and DeviceNotRegistered also clears User.push_token. A row already at received_on_device is never downgraded. Receipts for prompts sent before this change cannot be recovered.</w:t>
       </w:r>
     </w:p>
     <w:tbl>
@@ -2161,6 +2304,70 @@
           <w:p>
             <w:r>
               <w:t>jitai_log.status = "delivered", delivery_status = "accepted_by_expo", push_sent_at = now(); saved</w:t>
+            </w:r>
+          </w:p>
+        </w:tc>
+      </w:tr>
+      <w:tr>
+        <w:tc>
+          <w:tcPr>
+            <w:tcW w:type="dxa" w:w="2880"/>
+          </w:tcPr>
+          <w:p>
+            <w:r>
+              <w:t>Expo receipt 'ok' (15 min to 23 h later)</w:t>
+            </w:r>
+          </w:p>
+        </w:tc>
+        <w:tc>
+          <w:tcPr>
+            <w:tcW w:type="dxa" w:w="2880"/>
+          </w:tcPr>
+          <w:p>
+            <w:r>
+              <w:t>delivered</w:t>
+            </w:r>
+          </w:p>
+        </w:tc>
+        <w:tc>
+          <w:tcPr>
+            <w:tcW w:type="dxa" w:w="2880"/>
+          </w:tcPr>
+          <w:p>
+            <w:r>
+              <w:t>check_expo_receipts: delivery_status accepted_by_expo -&gt; handed_to_provider (added 2026-10-08); received_on_device is never downgraded</w:t>
+            </w:r>
+          </w:p>
+        </w:tc>
+      </w:tr>
+      <w:tr>
+        <w:tc>
+          <w:tcPr>
+            <w:tcW w:type="dxa" w:w="2880"/>
+          </w:tcPr>
+          <w:p>
+            <w:r>
+              <w:t>Expo receipt error (15 min to 23 h later)</w:t>
+            </w:r>
+          </w:p>
+        </w:tc>
+        <w:tc>
+          <w:tcPr>
+            <w:tcW w:type="dxa" w:w="2880"/>
+          </w:tcPr>
+          <w:p>
+            <w:r>
+              <w:t>failed</w:t>
+            </w:r>
+          </w:p>
+        </w:tc>
+        <w:tc>
+          <w:tcPr>
+            <w:tcW w:type="dxa" w:w="2880"/>
+          </w:tcPr>
+          <w:p>
+            <w:r>
+              <w:t>check_expo_receipts: delivery_status = "failed", delivery_error = "expo receipt: &lt;code&gt;"; DeviceNotRegistered also clears user.push_token (added 2026-10-08)</w:t>
             </w:r>
           </w:p>
         </w:tc>

</xml_diff>

<commit_message>
Updated cooldown to work only on posts sent and not failed
</commit_message>
<xml_diff>
--- a/Resources/JITAI_Task_Overview.docx
+++ b/Resources/JITAI_Task_Overview.docx
@@ -403,7 +403,7 @@
           </w:tcPr>
           <w:p>
             <w:r>
-              <w:t>Run eligibility check via apply_decision_rules() — MSSD vs. expanding within-person 80th-percentile threshold; apply_decision_rules also internally simulates a 60-minute cooldown and a 4/day cap, but as of 2026-10-01 production reads its decision_reason only as an MSSD-threshold verdict (MSSD_ELIGIBLE_REASONS in tasks.py treats 'prompt sent' / 'cooldown active' / 'daily cap reached' alike) — real cooldown/cap enforcement is a separate check, gate (c) below. Suppression gates (run-in and distress added 2026-09-21; cooldown/daily-cap added 2026-10-01): an MSSD-eligible decision is then checked, in this order, against (a) the run-in gate (protocol 9.3) — the EMA falls on study day &lt; RUN_IN_DAYS (7); study day is Eastern, anchored to User.enrolled_at, and fails closed if enrolled_at is null — (b) the distress override (protocol Section 11) — the participant has an active DistressFlag, baseline named ahead of momentary — and (c) the real cooldown/daily-cap check: a 60-minute cooldown and a 4/day cap counted against actual JITAILog(send_prompt=True) rows on the participant's Eastern calendar day (dashboard/data/windows.py::participant_day_bounds, via the shared _cooldown_cap_reason helper also used by POST /jitai/'s own safeguard recheck), replacing reliance on apply_decision_rules's own internal, UTC-day cap/cooldown simulation. Any of the three forces the decision ineligible before the randomization draw, in that same precedence order when more than one applies. Suppression only applies to decisions that passed the MSSD-threshold gate (decision_reason in MSSD_ELIGIBLE_REASONS); decisions that failed it keep the engine's own reason. The jitai_log row is still written with send_prompt=False, status and delivery_status both 'suppressed' (added 2026-09-24, migration 0049; 'not_sent' now remains only for ordinary ineligible decisions and eligible decisions the randomization did not send), randomization_draw, randomization_probability and message_arm all null, suppression_reason 'run_in' / 'distress_baseline' / 'distress_momentary' / 'cooldown' / 'daily_cap', and trigger_reason 'run-in period' / 'distress override (baseline)' / 'distress override (momentary)' / 'cooldown active' / 'daily cap reached'. Study Day 8 (study_day 7) is the first day a prompt can be sent. Check-ins and check-in reminders are unaffected. The dashboard randomization audit ignores rows with a suppression_reason. The monitoring layer counts them in MetricsDaily.suppressed_n (added 2026-09-24, dashboard migration 0005); they stay in decision_points_n and outside eligible_n, and the participant timeline labels them 'suppressed (run-in)' / 'suppressed (distress)'. Fixed 2026-10-01: apply_decision_rules's own internal cap/cooldown simulation still counts UTC days (documented in production_schema.md; harmless for its only remaining consumer, the synthetic-data/sensitivity-analysis pipeline), but production no longer relies on that verdict — real enforcement is the Eastern-day _cooldown_cap_reason check, gate (c) above.</w:t>
+              <w:t>Run eligibility check via apply_decision_rules() — MSSD vs. expanding within-person 80th-percentile threshold; apply_decision_rules also internally simulates a 60-minute cooldown and a 4/day cap, but as of 2026-10-01 production reads its decision_reason only as an MSSD-threshold verdict (MSSD_ELIGIBLE_REASONS in tasks.py treats 'prompt sent' / 'cooldown active' / 'daily cap reached' alike) — real cooldown/cap enforcement is a separate check, gate (c) below. Suppression gates (run-in and distress added 2026-09-21; cooldown/daily-cap added 2026-10-01): an MSSD-eligible decision is then checked, in this order, against (a) the run-in gate (protocol 9.3) — the EMA falls on study day &lt; RUN_IN_DAYS (7); study day is Eastern, anchored to User.enrolled_at, and fails closed if enrolled_at is null — (b) the distress override (protocol Section 11) — the participant has an active DistressFlag, baseline named ahead of momentary — and (c) the real cooldown/daily-cap check: a 60-minute cooldown and a 4/day cap counted against actual JITAILog(send_prompt=True) rows that have not failed on the participant's Eastern calendar day (dashboard/data/windows.py::participant_day_bounds, via the shared _cooldown_cap_reason helper also used by POST /jitai/'s own safeguard recheck), replacing reliance on apply_decision_rules's own internal, UTC-day cap/cooldown simulation. Any of the three forces the decision ineligible before the randomization draw, in that same precedence order when more than one applies. Suppression only applies to decisions that passed the MSSD-threshold gate (decision_reason in MSSD_ELIGIBLE_REASONS); decisions that failed it keep the engine's own reason. The jitai_log row is still written with send_prompt=False, status and delivery_status both 'suppressed' (added 2026-09-24, migration 0049; 'not_sent' now remains only for ordinary ineligible decisions and eligible decisions the randomization did not send), randomization_draw, randomization_probability and message_arm all null, suppression_reason 'run_in' / 'distress_baseline' / 'distress_momentary' / 'cooldown' / 'daily_cap', and trigger_reason 'run-in period' / 'distress override (baseline)' / 'distress override (momentary)' / 'cooldown active' / 'daily cap reached'. Study Day 8 (study_day 7) is the first day a prompt can be sent. Check-ins and check-in reminders are unaffected. The dashboard randomization audit ignores rows with a suppression_reason. The monitoring layer counts them in MetricsDaily.suppressed_n (added 2026-09-24, dashboard migration 0005); they stay in decision_points_n and outside eligible_n, and the participant timeline labels them 'suppressed (run-in)' / 'suppressed (distress)'. Fixed 2026-10-01: apply_decision_rules's own internal cap/cooldown simulation still counts UTC days (documented in production_schema.md; harmless for its only remaining consumer, the synthetic-data/sensitivity-analysis pipeline), but production no longer relies on that verdict — real enforcement is the Eastern-day _cooldown_cap_reason check, gate (c) above. Changed 2026-10-12: rows with delivery_status='failed' (no push token, Expo rejection, error receipt) are excluded from both the cooldown and the daily cap, so a failed send does not consume either; unconfirmed sends (pending, accepted_by_expo, handed_to_provider) still count because Expo receipts arrive 15 min to 23 h later. The last-5 message-repeat exclusion also skips failed sends.</w:t>
             </w:r>
           </w:p>
         </w:tc>
@@ -640,7 +640,7 @@
     <w:p>
       <w:pPr/>
       <w:r>
-        <w:t>Added 2026-09-30. POST /jitai/ was previously an unauthenticated internal path; evaluate_jitai_triggers has never called it — it writes jitai_log rows directly via the ORM (get_or_create on decision_point_id, section 5.2). The endpoint is now staff-only (IsAdminUser) for POST, and before saving it independently reruns the same protocol guards through _decision_point_safeguards (backend/app/tasks.py): run-in and distress via _protocol_override_reason, then cooldown and daily cap via the shared _cooldown_cap_reason helper — a 60-minute cooldown and a 4/day cap counted against actual JITAILog(send_prompt=True) rows on the participant's Eastern calendar day, in that order. Fixed 2026-10-01: _cooldown_cap_reason replaces this endpoint's own previously-independent, UTC-day cooldown/cap query, and is now also shared with evaluate_jitai_triggers itself (section 3, step 5). If any guard fails, the submitted row is overwritten before save — send_prompt=False, status and delivery_status='suppressed', randomization_probability and randomization_draw forced null, and suppression_reason set to the failing guard: 'run_in', 'distress_baseline', 'distress_momentary', 'cooldown' or 'daily_cap' (migration 0050; as of 2026-10-01 all four reasons, including 'cooldown'/'daily_cap', can also be produced by evaluate_jitai_triggers itself via the same shared _cooldown_cap_reason check). The mobile app's dev-only 'simulate JITAI push' action (ComposeScreen) called this endpoint as a logged-in participant; that call now needs staff auth to succeed.</w:t>
+        <w:t>Added 2026-09-30. POST /jitai/ was previously an unauthenticated internal path; evaluate_jitai_triggers has never called it — it writes jitai_log rows directly via the ORM (get_or_create on decision_point_id, section 5.2). The endpoint is now staff-only (IsAdminUser) for POST, and before saving it independently reruns the same protocol guards through _decision_point_safeguards (backend/app/tasks.py): run-in and distress via _protocol_override_reason, then cooldown and daily cap via the shared _cooldown_cap_reason helper — a 60-minute cooldown and a 4/day cap counted against actual JITAILog(send_prompt=True) rows that have not failed on the participant's Eastern calendar day, in that order. Fixed 2026-10-01: _cooldown_cap_reason replaces this endpoint's own previously-independent, UTC-day cooldown/cap query, and is now also shared with evaluate_jitai_triggers itself (section 3, step 5). If any guard fails, the submitted row is overwritten before save — send_prompt=False, status and delivery_status='suppressed', randomization_probability and randomization_draw forced null, and suppression_reason set to the failing guard: 'run_in', 'distress_baseline', 'distress_momentary', 'cooldown' or 'daily_cap' (migration 0050; as of 2026-10-01 all four reasons, including 'cooldown'/'daily_cap', can also be produced by evaluate_jitai_triggers itself via the same shared _cooldown_cap_reason check). The mobile app's dev-only 'simulate JITAI push' action (ComposeScreen) called this endpoint as a logged-in participant; that call now needs staff auth to succeed. Changed 2026-10-12: rows with delivery_status='failed' (no push token, Expo rejection, error receipt) are excluded from both the cooldown and the daily cap, so a failed send does not consume either; unconfirmed sends (pending, accepted_by_expo, handed_to_provider) still count because Expo receipts arrive 15 min to 23 h later. The last-5 message-repeat exclusion also skips failed sends.</w:t>
       </w:r>
     </w:p>
     <w:p>
@@ -1938,7 +1938,7 @@
           </w:tcPr>
           <w:p>
             <w:r>
-              <w:t>'run_in', 'distress_baseline' or 'distress_momentary' when an engine-eligible decision was withheld before the randomization draw; blank otherwise. Run-in takes precedence, then distress (baseline ahead of momentary). Such rows carry status and delivery_status = 'suppressed' (relabeled from 'not_sent' 2026-09-24, migration 0049, which also backfilled existing rows and set suppression_reason='run_in' on legacy 'run-in period' rows), and randomization_draw, randomization_probability and message_arm = null; the JITAI API serializer exposes suppression_reason read-only, and the dashboard randomization audit ignores them, so they are not mistaken for dropped prompts (migration 0048). Added 2026-09-30 (migration 0050): 'cooldown' and 'daily_cap' are two further choices. Fixed 2026-10-01: both evaluate_jitai_triggers (step 5 above) and POST /jitai/'s own safeguard recheck (section 3d) can write them, via the single shared _cooldown_cap_reason helper — real JITAILog(send_prompt=True) history on the participant's Eastern calendar day. Previously evaluate_jitai_triggers trusted apply_decision_rules's own internal, UTC-day cap/cooldown simulation instead of real send history, and POST /jitai/'s recheck had its own separate, also-UTC-day query — both were defects, now fixed by the shared helper.</w:t>
+              <w:t>'run_in', 'distress_baseline' or 'distress_momentary' when an engine-eligible decision was withheld before the randomization draw; blank otherwise. Run-in takes precedence, then distress (baseline ahead of momentary). Such rows carry status and delivery_status = 'suppressed' (relabeled from 'not_sent' 2026-09-24, migration 0049, which also backfilled existing rows and set suppression_reason='run_in' on legacy 'run-in period' rows), and randomization_draw, randomization_probability and message_arm = null; the JITAI API serializer exposes suppression_reason read-only, and the dashboard randomization audit ignores them, so they are not mistaken for dropped prompts (migration 0048). Added 2026-09-30 (migration 0050): 'cooldown' and 'daily_cap' are two further choices. Fixed 2026-10-01: both evaluate_jitai_triggers (step 5 above) and POST /jitai/'s own safeguard recheck (section 3d) can write them, via the single shared _cooldown_cap_reason helper — real JITAILog(send_prompt=True) history (excluding delivery_status='failed' sends) on the participant's Eastern calendar day. Previously evaluate_jitai_triggers trusted apply_decision_rules's own internal, UTC-day cap/cooldown simulation instead of real send history, and POST /jitai/'s recheck had its own separate, also-UTC-day query — both were defects, now fixed by the shared helper. Changed 2026-10-12: rows with delivery_status='failed' (no push token, Expo rejection, error receipt) are excluded from both the cooldown and the daily cap, so a failed send does not consume either; unconfirmed sends (pending, accepted_by_expo, handed_to_provider) still count because Expo receipts arrive 15 min to 23 h later. The last-5 message-repeat exclusion also skips failed sends.</w:t>
             </w:r>
           </w:p>
         </w:tc>

</xml_diff>

<commit_message>
Add distress_flag_active to decision rows and distress_active to /ema/next/
JITAILog.distress_flag_active (migration 0054) is set on every decision row
from the flag state at write time, in _evaluate_user and POST /jitai/. It is
context only: decision logic and suppression_reason are unchanged. Exposed on
the JITAI API, monitor decision events and timeline, and analytics loaders.

backfill_distress_flag_active fills older rows from DistressFlag.was_active_at
(--dry-run, --user, idempotent).

GET /ema/next/ now returns distress_active on every 200 response so the app
can tell a flag is active. It does not change what is served.

Syncs CLAUDE.md and the two status docx files.
</commit_message>
<xml_diff>
--- a/Resources/JITAI_Task_Overview.docx
+++ b/Resources/JITAI_Task_Overview.docx
@@ -620,7 +620,7 @@
     <w:p>
       <w:pPr/>
       <w:r>
-        <w:t>Added 2026-09-21, protocol Section 11. Built in code (backend/app/distress.py, DistressFlag model, migration 0048) and checked inside _evaluate_user after the run-in gate and before the randomization draw. An active flag suspends randomization: the decision is logged with send_prompt=False, status and delivery_status 'suppressed' (since 2026-09-24), suppression_reason 'distress_baseline' or 'distress_momentary', and null draw/probability/arm (baseline is named ahead of momentary when both are active; run-in wins over both). Baseline flags come from the Qualtrics baseline screens with signal codes phq9_self_harm, phq9_severity, scoff, audit_c, problem_gambling, food_insecurity and free_text_risk (codes only — never a score or free text), and pause prompts until staff mark the contact documented via the Django Admin action 'Mark contact documented'; randomization then resumes. Momentary flags are raised when a submitted check-in has ANY of B1_valence == 1, B2_stress == 7, B1_affect_sad == 5 or B1_affect_anxious == 5 — exact values, not thresholds, confirmed by Dr. Chang 2026-09-22 (DISTRESS_B1_VALENCE_FLOOR=1, DISTRESS_B2_STRESS_CEILING=7, DISTRESS_B1_AFFECT_CEILING=5 in dashboard/data/config.py) — and pause prompts for DISTRESS_MOMENTARY_PAUSE_HOURS (24). Signal codes are b1_low_valence, b2_high_stress, b1_affect_sad and b1_affect_anxious; several can fire on one check-in and all are recorded. Skipped items never fire, and out-of-range values are rejected by the serializer before storage. This is separate from the ROUTING_TRIGGER_RULES inequality cutoffs used for coping-message topic selection. POST /ema/responses/ returns a resource_card ({title, message, resources[]}), null when no override is active, after any check-in submitted under an active override;  the mobile EMA modal shows it in a 'resources' phase with a Done button and tap-to-call. The card message opens with the 911 instruction, and RESOURCE_CARD_RESOURCES holds the seven resources from the study's resource document (Campus Counseling Center, 988 Suicide and Crisis Lifeline, Hitchcock Field &amp; Fork Pantry, National Alliance for Eating Disorders Helpline, SAMHSA National Helpline, National Problem Gambling Helpline, Florida's Gambling Helpline) with digits-only contacts for tap-to-call. Decisions by Dr. Chang 2026-09-23: staff alerts come from Qualtrics (it emails the PI and staff when a flagged baseline is submitted), not the backend, and the import only suppresses; contact_documented_at is a timestamp only, with who called and what was given kept in the staff contact log outside Django; staff mark a baseline flag documented in Django Admin (same day for the two PHQ-9 flags, at the next visit for alcohol/eating/gambling/food), and an unmarked flag suppresses that participant for the rest of the study by design; in-app (momentary) flags are resource-card-only with no staff notice; free_text_risk stays a manual Admin flag.</w:t>
+        <w:t>Added 2026-09-21, protocol Section 11. Built in code (backend/app/distress.py, DistressFlag model, migration 0048) and checked inside _evaluate_user after the run-in gate and before the randomization draw. An active flag suspends randomization: the decision is logged with send_prompt=False, status and delivery_status 'suppressed' (since 2026-09-24), suppression_reason 'distress_baseline' or 'distress_momentary', and null draw/probability/arm (baseline is named ahead of momentary when both are active; run-in wins over both). Baseline flags come from the Qualtrics baseline screens with signal codes phq9_self_harm, phq9_severity, scoff, audit_c, problem_gambling, food_insecurity and free_text_risk (codes only — never a score or free text), and pause prompts until staff mark the contact documented via the Django Admin action 'Mark contact documented'; randomization then resumes. Momentary flags are raised when a submitted check-in has ANY of B1_valence == 1, B2_stress == 7, B1_affect_sad == 5 or B1_affect_anxious == 5 — exact values, not thresholds, confirmed by Dr. Chang 2026-09-22 (DISTRESS_B1_VALENCE_FLOOR=1, DISTRESS_B2_STRESS_CEILING=7, DISTRESS_B1_AFFECT_CEILING=5 in dashboard/data/config.py) — and pause prompts for DISTRESS_MOMENTARY_PAUSE_HOURS (24). Signal codes are b1_low_valence, b2_high_stress, b1_affect_sad and b1_affect_anxious; several can fire on one check-in and all are recorded. Skipped items never fire, and out-of-range values are rejected by the serializer before storage. This is separate from the ROUTING_TRIGGER_RULES inequality cutoffs used for coping-message topic selection. POST /ema/responses/ returns a resource_card ({title, message, resources[]}), null when no override is active, after any check-in submitted under an active override;  the mobile EMA modal shows it in a 'resources' phase with a Done button and tap-to-call. The card message opens with the 911 instruction, and RESOURCE_CARD_RESOURCES holds the seven resources from the study's resource document (Campus Counseling Center, 988 Suicide and Crisis Lifeline, Hitchcock Field &amp; Fork Pantry, National Alliance for Eating Disorders Helpline, SAMHSA National Helpline, National Problem Gambling Helpline, Florida's Gambling Helpline) with digits-only contacts for tap-to-call. Decisions by Dr. Chang 2026-09-23: staff alerts come from Qualtrics (it emails the PI and staff when a flagged baseline is submitted), not the backend, and the import only suppresses; contact_documented_at is a timestamp only, with who called and what was given kept in the staff contact log outside Django; staff mark a baseline flag documented in Django Admin (same day for the two PHQ-9 flags, at the next visit for alcohol/eating/gambling/food), and an unmarked flag suppresses that participant for the rest of the study by design; in-app (momentary) flags are resource-card-only with no staff notice; free_text_risk stays a manual Admin flag. Added 2026-10-17: every 200 response from GET /ema/next/ now also carries a boolean distress_active, true when a baseline or momentary distress flag is active for the participant. It is informational only and does not change what /ema/next/ serves. Added 2026-10-19 (migration 0054): JITAILog.distress_flag_active is true on every decision row written while any distress flag was active (baseline or momentary), whether the row was below threshold, run-in, randomized out or sent. It is context only: it does not drive any decision, and suppression_reason still records what blocked a prompt. It is exposed on the JITAI API, the monitor decision events and timeline, and analytics (JITAILog now has 37 columns). manage.py backfill_distress_flag_active [--dry-run] [--user &lt;id&gt;] fills older rows. Added 2026-10-19: POST /ema/responses/ returns the resource card after any flagged check-in whether or not a decision point was due, and nothing logs the app rendering it.</w:t>
       </w:r>
     </w:p>
     <w:p>
@@ -1938,7 +1938,7 @@
           </w:tcPr>
           <w:p>
             <w:r>
-              <w:t>'run_in', 'distress_baseline' or 'distress_momentary' when an engine-eligible decision was withheld before the randomization draw; blank otherwise. Run-in takes precedence, then distress (baseline ahead of momentary). Such rows carry status and delivery_status = 'suppressed' (relabeled from 'not_sent' 2026-09-24, migration 0049, which also backfilled existing rows and set suppression_reason='run_in' on legacy 'run-in period' rows), and randomization_draw, randomization_probability and message_arm = null; the JITAI API serializer exposes suppression_reason read-only, and the dashboard randomization audit ignores them, so they are not mistaken for dropped prompts (migration 0048). Added 2026-09-30 (migration 0050): 'cooldown' and 'daily_cap' are two further choices. Fixed 2026-10-01: both evaluate_jitai_triggers (step 5 above) and POST /jitai/'s own safeguard recheck (section 3d) can write them, via the single shared _cooldown_cap_reason helper — real JITAILog(send_prompt=True) history (excluding delivery_status='failed' sends) on the participant's Eastern calendar day. Previously evaluate_jitai_triggers trusted apply_decision_rules's own internal, UTC-day cap/cooldown simulation instead of real send history, and POST /jitai/'s recheck had its own separate, also-UTC-day query — both were defects, now fixed by the shared helper. Changed 2026-10-12: rows with delivery_status='failed' (no push token, Expo rejection, error receipt) are excluded from both the cooldown and the daily cap, so a failed send does not consume either; unconfirmed sends (pending, accepted_by_expo, handed_to_provider) still count because Expo receipts arrive 15 min to 23 h later. The last-5 message-repeat exclusion also skips failed sends.</w:t>
+              <w:t>'run_in', 'distress_baseline' or 'distress_momentary' when an engine-eligible decision was withheld before the randomization draw; blank otherwise. Run-in takes precedence, then distress (baseline ahead of momentary). Such rows carry status and delivery_status = 'suppressed' (relabeled from 'not_sent' 2026-09-24, migration 0049, which also backfilled existing rows and set suppression_reason='run_in' on legacy 'run-in period' rows), and randomization_draw, randomization_probability and message_arm = null; the JITAI API serializer exposes suppression_reason read-only, and the dashboard randomization audit ignores them, so they are not mistaken for dropped prompts (migration 0048). Added 2026-09-30 (migration 0050): 'cooldown' and 'daily_cap' are two further choices. Fixed 2026-10-01: both evaluate_jitai_triggers (step 5 above) and POST /jitai/'s own safeguard recheck (section 3d) can write them, via the single shared _cooldown_cap_reason helper — real JITAILog(send_prompt=True) history (excluding delivery_status='failed' sends) on the participant's Eastern calendar day. Previously evaluate_jitai_triggers trusted apply_decision_rules's own internal, UTC-day cap/cooldown simulation instead of real send history, and POST /jitai/'s recheck had its own separate, also-UTC-day query — both were defects, now fixed by the shared helper. Changed 2026-10-12: rows with delivery_status='failed' (no push token, Expo rejection, error receipt) are excluded from both the cooldown and the daily cap, so a failed send does not consume either; unconfirmed sends (pending, accepted_by_expo, handed_to_provider) still count because Expo receipts arrive 15 min to 23 h later. The last-5 message-repeat exclusion also skips failed sends. Added 2026-10-19 (migration 0054): JITAILog.distress_flag_active is true on every decision row written while any distress flag was active (baseline or momentary), whether the row was below threshold, run-in, randomized out or sent. It is context only: it does not drive any decision, and suppression_reason still records what blocked a prompt. It is exposed on the JITAI API, the monitor decision events and timeline, and analytics (JITAILog now has 37 columns). manage.py backfill_distress_flag_active [--dry-run] [--user &lt;id&gt;] fills older rows.</w:t>
             </w:r>
           </w:p>
         </w:tc>

</xml_diff>

<commit_message>
Log resource card display and app build on each check-in
Adds EngagementLog events resource_card_shown_checkin (linked to the
check-in that returned the card via a new ema FK) and
resource_card_shown_home, fired once each time the app puts the card on
screen. EMA gains app_version/app_build, sent on submit from
expo-application; blank means an older build. Engagement posts reject an
ema belonging to another user. Migration 0056.

Needs a new native build for expo-application.
</commit_message>
<xml_diff>
--- a/Resources/JITAI_Task_Overview.docx
+++ b/Resources/JITAI_Task_Overview.docx
@@ -620,13 +620,13 @@
     <w:p>
       <w:pPr/>
       <w:r>
-        <w:t>Added 2026-09-21, protocol Section 11. Built in code (backend/app/distress.py, DistressFlag model, migration 0048) and checked inside _evaluate_user after the run-in gate and before the randomization draw. An active flag suspends randomization: the decision is logged with send_prompt=False, status and delivery_status 'suppressed' (since 2026-09-24), suppression_reason 'distress_baseline' or 'distress_momentary', and null draw/probability/arm (baseline is named ahead of momentary when both are active; run-in wins over both). Baseline flags come from the Qualtrics baseline screens with signal codes phq9_self_harm, phq9_severity, scoff, audit_c, problem_gambling, food_insecurity and free_text_risk (codes only — never a score or free text), and pause prompts until staff mark the contact documented via the Django Admin action 'Mark contact documented'; randomization then resumes. Momentary flags are raised when a submitted check-in has ANY of B1_valence == 1, B2_stress == 7, B1_affect_sad == 5 or B1_affect_anxious == 5 — exact values, not thresholds, confirmed by Dr. Chang 2026-09-22 (DISTRESS_B1_VALENCE_FLOOR=1, DISTRESS_B2_STRESS_CEILING=7, DISTRESS_B1_AFFECT_CEILING=5 in dashboard/data/config.py) — and pause prompts for DISTRESS_MOMENTARY_PAUSE_HOURS (24). Signal codes are b1_low_valence, b2_high_stress, b1_affect_sad and b1_affect_anxious; several can fire on one check-in and all are recorded. Skipped items never fire, and out-of-range values are rejected by the serializer before storage. This is separate from the ROUTING_TRIGGER_RULES inequality cutoffs used for coping-message topic selection. POST /ema/responses/ returns a resource_card ({title, message, resources[]}), null when no override is active, after any check-in submitted under an active override;  the mobile EMA modal shows it in a 'resources' phase with a Done button and tap-to-call. The card message opens with the 911 instruction, and RESOURCE_CARD_RESOURCES holds the seven resources from the study's resource document (Campus Counseling Center, 988 Suicide and Crisis Lifeline, Hitchcock Field &amp; Fork Pantry, National Alliance for Eating Disorders Helpline, SAMHSA National Helpline, National Problem Gambling Helpline, Florida's Gambling Helpline) with digits-only contacts for tap-to-call. Decisions by Dr. Chang 2026-09-23: staff alerts come from Qualtrics (it emails the PI and staff when a flagged baseline is submitted), not the backend, and the import only suppresses; contact_documented_at is a timestamp only, with who called and what was given kept in the staff contact log outside Django; staff mark a baseline flag documented in Django Admin (same day for the two PHQ-9 flags, at the next visit for alcohol/eating/gambling/food), and an unmarked flag suppresses that participant for the rest of the study by design; in-app (momentary) flags are resource-card-only with no staff notice; free_text_risk stays a manual Admin flag. Added 2026-10-17: every 200 response from GET /ema/next/ now also carries a boolean distress_active, true when a baseline or momentary distress flag is active for the participant. It is informational only and does not change what /ema/next/ serves. Added 2026-10-19 (migration 0054): JITAILog.distress_flag_active is true on every decision row written while any distress flag was active (baseline or momentary), whether the row was below threshold, run-in, randomized out or sent. It is context only: it does not drive any decision, and suppression_reason still records what blocked a prompt. It is exposed on the JITAI API, the monitor decision events and timeline, and analytics (JITAILog now has 37 columns). manage.py backfill_distress_flag_active [--dry-run] [--user &lt;id&gt;] fills older rows. Added 2026-10-19: POST /ema/responses/ returns the resource card after any flagged check-in whether or not a decision point was due, and nothing logs the app rendering it.</w:t>
+        <w:t>Added 2026-09-21, protocol Section 11. Built in code (backend/app/distress.py, DistressFlag model, migration 0048) and checked inside _evaluate_user after the run-in gate and before the randomization draw. An active flag suspends randomization: the decision is logged with send_prompt=False, status and delivery_status 'suppressed' (since 2026-09-24), suppression_reason 'distress_baseline' or 'distress_momentary', and null draw/probability/arm (baseline is named ahead of momentary when both are active; run-in wins over both). Baseline flags come from the Qualtrics baseline screens with signal codes phq9_self_harm, phq9_severity, scoff, audit_c, problem_gambling, food_insecurity and free_text_risk (codes only — never a score or free text), and pause prompts until staff mark the contact documented via the Django Admin action 'Mark contact documented'; randomization then resumes. Momentary flags are raised when a submitted check-in has ANY of B1_valence == 1, B2_stress == 7, B1_affect_sad == 5 or B1_affect_anxious == 5 — exact values, not thresholds, confirmed by Dr. Chang 2026-09-22 (DISTRESS_B1_VALENCE_FLOOR=1, DISTRESS_B2_STRESS_CEILING=7, DISTRESS_B1_AFFECT_CEILING=5 in dashboard/data/config.py) — and pause prompts for DISTRESS_MOMENTARY_PAUSE_HOURS (24). Signal codes are b1_low_valence, b2_high_stress, b1_affect_sad and b1_affect_anxious; several can fire on one check-in and all are recorded. Skipped items never fire, and out-of-range values are rejected by the serializer before storage. This is separate from the ROUTING_TRIGGER_RULES inequality cutoffs used for coping-message topic selection. POST /ema/responses/ returns a resource_card ({title, message, resources[]}), null when no override is active, after any check-in submitted under an active override;  the mobile EMA modal shows it in a 'resources' phase with a Done button and tap-to-call. The card message opens with the 911 instruction, and RESOURCE_CARD_RESOURCES holds the seven resources from the study's resource document (Campus Counseling Center, 988 Suicide and Crisis Lifeline, Hitchcock Field &amp; Fork Pantry, National Alliance for Eating Disorders Helpline, SAMHSA National Helpline, National Problem Gambling Helpline, Florida's Gambling Helpline) with digits-only contacts for tap-to-call. Decisions by Dr. Chang 2026-09-23: staff alerts come from Qualtrics (it emails the PI and staff when a flagged baseline is submitted), not the backend, and the import only suppresses; contact_documented_at is a timestamp only, with who called and what was given kept in the staff contact log outside Django; staff mark a baseline flag documented in Django Admin (same day for the two PHQ-9 flags, at the next visit for alcohol/eating/gambling/food), and an unmarked flag suppresses that participant for the rest of the study by design; in-app (momentary) flags are resource-card-only with no staff notice; free_text_risk stays a manual Admin flag. Added 2026-10-17: every 200 response from GET /ema/next/ now also carries a boolean distress_active, true when a baseline or momentary distress flag is active for the participant. It is informational only and does not change what /ema/next/ serves. Added 2026-10-19 (migration 0054): JITAILog.distress_flag_active is true on every decision row written while any distress flag was active (baseline or momentary), whether the row was below threshold, run-in, randomized out or sent. It is context only: it does not drive any decision, and suppression_reason still records what blocked a prompt. It is exposed on the JITAI API, the monitor decision events and timeline, and analytics (JITAILog now has 37 columns). manage.py backfill_distress_flag_active [--dry-run] [--user &lt;id&gt;] fills older rows. Added 2026-10-19: POST /ema/responses/ returns the resource card after any flagged check-in whether or not a decision point was due, and nothing logged the app rendering it. Updated 2026-10-22 (migration 0056): the app now logs engagement_log events resource_card_shown_checkin (card rendered after a flagged check-in; the new nullable EngagementLog.ema FK links the check-in that returned it) and resource_card_shown_home (card rendered on the home screen while a distress flag is active), once each time the card mounts on screen. Logging is fire-and-forget with no retry, and older builds log neither. EMA also gains app_version and app_build (blank = older build), sent by the app on POST /ema/responses/ from expo-application, so the backend can now see which build a check-in came from. POST /telemetry/engagement/ rejects an ema belonging to another user (400). The mobile change adds the expo-application native dependency and needs a new native build.</w:t>
       </w:r>
     </w:p>
     <w:p>
       <w:pPr/>
       <w:r>
-        <w:t>Baseline flags can be ingested in bulk, by hand (there is no schedule), through either of two front ends that share one function, import_baseline_flags in backend/app/baseline_import.py: `manage.py import_baseline_distress_flags --file &lt;path&gt; [--dry-run]` (--id-column defaults to participant_id and --id-field defaults to user_id, since the export's participant_id is the numeric User.user_id; both are overridable), which scores a Qualtrics export and maps it to six of the seven signal codes above — all but free_text_risk, which has no source column in this pipeline (analytics/baseline_survey_scoring/section11.py) — and skips any row whose exact signal set is already on record for that user. The second front end is the 'Import baseline export' button on Django Admin &gt; Distress flags (DistressFlagAdmin.import_baseline_view), which lets staff run the import without a shell or database access. Staff with the add-flag permission upload the Qualtrics export as a CSV (5 MB cap; .xlsx is not supported); the file is read in memory and never saved, and only signal codes are stored. The page previews by default (nothing is written) and lists what would be created, rows already on record, rows with a blank screening item, unrecognized columns and unmatched participant IDs. To write, staff choose the file again, uncheck 'Preview only' and submit. The write is refused if any screening instrument's items (PHQ-9, SCOFF, AUDIT-C, PGSI, Hunger Vital Sign) are missing from the export, because nobody could be flagged on that screen; creation is all-or-nothing, and every flag created gets a Django Admin log entry showing who imported it. The export is read by qualtrics.read_export (a path or file-like object; returns the frame plus diagnostics), which load_export wraps. Still open: (1) the import has not been run on a real export (it waits for the RS01-RS04 accounts); (2) the mobile resource screen must be tested on iPhone and Android and shipped to all participants before Day 8 (2026-09-28); (3) the backend and migrations 0049 (app) and 0005 (dashboard) must be deployed first; (4) the backend cannot see the app version, so old builds are suppressed but show no card.</w:t>
+        <w:t>Baseline flags can be ingested in bulk, by hand (there is no schedule), through either of two front ends that share one function, import_baseline_flags in backend/app/baseline_import.py: `manage.py import_baseline_distress_flags --file &lt;path&gt; [--dry-run]` (--id-column defaults to participant_id and --id-field defaults to user_id, since the export's participant_id is the numeric User.user_id; both are overridable), which scores a Qualtrics export and maps it to six of the seven signal codes above — all but free_text_risk, which has no source column in this pipeline (analytics/baseline_survey_scoring/section11.py) — and skips any row whose exact signal set is already on record for that user. The second front end is the 'Import baseline export' button on Django Admin &gt; Distress flags (DistressFlagAdmin.import_baseline_view), which lets staff run the import without a shell or database access. Staff with the add-flag permission upload the Qualtrics export as a CSV (5 MB cap; .xlsx is not supported); the file is read in memory and never saved, and only signal codes are stored. The page previews by default (nothing is written) and lists what would be created, rows already on record, rows with a blank screening item, unrecognized columns and unmatched participant IDs. To write, staff choose the file again, uncheck 'Preview only' and submit. The write is refused if any screening instrument's items (PHQ-9, SCOFF, AUDIT-C, PGSI, Hunger Vital Sign) are missing from the export, because nobody could be flagged on that screen; creation is all-or-nothing, and every flag created gets a Django Admin log entry showing who imported it. The export is read by qualtrics.read_export (a path or file-like object; returns the frame plus diagnostics), which load_export wraps. Still open: (1) the import has not been run on a real export (it waits for the RS01-RS04 accounts); (2) the mobile resource screen must be tested on iPhone and Android and shipped to all participants before Day 8 (2026-09-28); (3) the backend and migrations 0049 (app) and 0005 (dashboard) must be deployed first; (4) as of 2026-10-22 (migration 0056) EMA.app_version / app_build record the build that submitted each check-in (blank = older build, which is suppressed but shows no card).</w:t>
       </w:r>
     </w:p>
     <w:p>

</xml_diff>